<commit_message>
Correct ticket flow in manual: approve sets Open, not Approved.
Co-authored-by: Cursor <cursoragent@cursor.com>
</commit_message>
<xml_diff>
--- a/docs/TARF_Employee_User_Manual_V1.docx
+++ b/docs/TARF_Employee_User_Manual_V1.docx
@@ -1374,7 +1374,7 @@
           <w:sz w:val="22"/>
           <w:szCs w:val="22"/>
         </w:rPr>
-        <w:t xml:space="preserve">Users can monitor ticket statuses such as Pending Approval, Approved, Rejected, Open, In Progress, Pending, Resolved, Closed, and Reopened.</w:t>
+        <w:t xml:space="preserve">Users can monitor ticket statuses such as Pending Approval, Open, Rejected, In Progress, Pending, Resolved, Closed, and Reopened.</w:t>
       </w:r>
     </w:p>
     <w:p>
@@ -3123,7 +3123,7 @@
           <w:sz w:val="22"/>
           <w:szCs w:val="22"/>
         </w:rPr>
-        <w:t xml:space="preserve">After approval, assign ICT personnel using Assign personnel, then click Assign. The ticket moves to In Progress when assignment is completed as designed.</w:t>
+        <w:t xml:space="preserve">After approval, the ticket status becomes Open. Assign ICT personnel using Assign personnel, then click Assign. The ticket moves to In Progress.</w:t>
       </w:r>
     </w:p>
     <w:p>
@@ -5409,16 +5409,16 @@
           <w:sz w:val="22"/>
           <w:szCs w:val="22"/>
         </w:rPr>
-        <w:t xml:space="preserve">Approved. </w:t>
-      </w:r>
-      <w:r>
-        <w:rPr>
-          <w:rFonts w:ascii="Times New Roman" w:cs="Times New Roman" w:eastAsia="Times New Roman" w:hAnsi="Times New Roman"/>
-          <w:color w:val="1A1A1A"/>
-          <w:sz w:val="22"/>
-          <w:szCs w:val="22"/>
-        </w:rPr>
-        <w:t xml:space="preserve">Approved; ready for assignment or processing.</w:t>
+        <w:t xml:space="preserve">Open. </w:t>
+      </w:r>
+      <w:r>
+        <w:rPr>
+          <w:rFonts w:ascii="Times New Roman" w:cs="Times New Roman" w:eastAsia="Times New Roman" w:hAnsi="Times New Roman"/>
+          <w:color w:val="1A1A1A"/>
+          <w:sz w:val="22"/>
+          <w:szCs w:val="22"/>
+        </w:rPr>
+        <w:t xml:space="preserve">Approved by Admin; ready for assignment or processing. (Approve sets Open — there is no separate Approved ticket status.)</w:t>
       </w:r>
     </w:p>
     <w:p>
@@ -5455,7 +5455,7 @@
           <w:sz w:val="22"/>
           <w:szCs w:val="22"/>
         </w:rPr>
-        <w:t xml:space="preserve">Rejected with reason.</w:t>
+        <w:t xml:space="preserve">Rejected with reason (terminal; submit a new request if needed).</w:t>
       </w:r>
     </w:p>
     <w:p>
@@ -5483,16 +5483,16 @@
           <w:sz w:val="22"/>
           <w:szCs w:val="22"/>
         </w:rPr>
-        <w:t xml:space="preserve">Open. </w:t>
-      </w:r>
-      <w:r>
-        <w:rPr>
-          <w:rFonts w:ascii="Times New Roman" w:cs="Times New Roman" w:eastAsia="Times New Roman" w:hAnsi="Times New Roman"/>
-          <w:color w:val="1A1A1A"/>
-          <w:sz w:val="22"/>
-          <w:szCs w:val="22"/>
-        </w:rPr>
-        <w:t xml:space="preserve">Active or assignable.</w:t>
+        <w:t xml:space="preserve">In Progress. </w:t>
+      </w:r>
+      <w:r>
+        <w:rPr>
+          <w:rFonts w:ascii="Times New Roman" w:cs="Times New Roman" w:eastAsia="Times New Roman" w:hAnsi="Times New Roman"/>
+          <w:color w:val="1A1A1A"/>
+          <w:sz w:val="22"/>
+          <w:szCs w:val="22"/>
+        </w:rPr>
+        <w:t xml:space="preserve">ICT personnel assigned; work ongoing.</w:t>
       </w:r>
     </w:p>
     <w:p>
@@ -5520,16 +5520,16 @@
           <w:sz w:val="22"/>
           <w:szCs w:val="22"/>
         </w:rPr>
-        <w:t xml:space="preserve">In Progress. </w:t>
-      </w:r>
-      <w:r>
-        <w:rPr>
-          <w:rFonts w:ascii="Times New Roman" w:cs="Times New Roman" w:eastAsia="Times New Roman" w:hAnsi="Times New Roman"/>
-          <w:color w:val="1A1A1A"/>
-          <w:sz w:val="22"/>
-          <w:szCs w:val="22"/>
-        </w:rPr>
-        <w:t xml:space="preserve">ICT assigned; work ongoing.</w:t>
+        <w:t xml:space="preserve">Pending. </w:t>
+      </w:r>
+      <w:r>
+        <w:rPr>
+          <w:rFonts w:ascii="Times New Roman" w:cs="Times New Roman" w:eastAsia="Times New Roman" w:hAnsi="Times New Roman"/>
+          <w:color w:val="1A1A1A"/>
+          <w:sz w:val="22"/>
+          <w:szCs w:val="22"/>
+        </w:rPr>
+        <w:t xml:space="preserve">Holding status set by Admin after approval.</w:t>
       </w:r>
     </w:p>
     <w:p>
@@ -5557,16 +5557,16 @@
           <w:sz w:val="22"/>
           <w:szCs w:val="22"/>
         </w:rPr>
-        <w:t xml:space="preserve">Pending. </w:t>
-      </w:r>
-      <w:r>
-        <w:rPr>
-          <w:rFonts w:ascii="Times New Roman" w:cs="Times New Roman" w:eastAsia="Times New Roman" w:hAnsi="Times New Roman"/>
-          <w:color w:val="1A1A1A"/>
-          <w:sz w:val="22"/>
-          <w:szCs w:val="22"/>
-        </w:rPr>
-        <w:t xml:space="preserve">Holding status set by Admin.</w:t>
+        <w:t xml:space="preserve">Resolved. </w:t>
+      </w:r>
+      <w:r>
+        <w:rPr>
+          <w:rFonts w:ascii="Times New Roman" w:cs="Times New Roman" w:eastAsia="Times New Roman" w:hAnsi="Times New Roman"/>
+          <w:color w:val="1A1A1A"/>
+          <w:sz w:val="22"/>
+          <w:szCs w:val="22"/>
+        </w:rPr>
+        <w:t xml:space="preserve">Requestor marked service complete; feedback or close is next.</w:t>
       </w:r>
     </w:p>
     <w:p>
@@ -5594,16 +5594,16 @@
           <w:sz w:val="22"/>
           <w:szCs w:val="22"/>
         </w:rPr>
-        <w:t xml:space="preserve">Resolved. </w:t>
-      </w:r>
-      <w:r>
-        <w:rPr>
-          <w:rFonts w:ascii="Times New Roman" w:cs="Times New Roman" w:eastAsia="Times New Roman" w:hAnsi="Times New Roman"/>
-          <w:color w:val="1A1A1A"/>
-          <w:sz w:val="22"/>
-          <w:szCs w:val="22"/>
-        </w:rPr>
-        <w:t xml:space="preserve">Requestor marked service complete; feedback or close is next.</w:t>
+        <w:t xml:space="preserve">Closed. </w:t>
+      </w:r>
+      <w:r>
+        <w:rPr>
+          <w:rFonts w:ascii="Times New Roman" w:cs="Times New Roman" w:eastAsia="Times New Roman" w:hAnsi="Times New Roman"/>
+          <w:color w:val="1A1A1A"/>
+          <w:sz w:val="22"/>
+          <w:szCs w:val="22"/>
+        </w:rPr>
+        <w:t xml:space="preserve">Closed after feedback (requestor confirmed satisfied).</w:t>
       </w:r>
     </w:p>
     <w:p>
@@ -5631,43 +5631,6 @@
           <w:sz w:val="22"/>
           <w:szCs w:val="22"/>
         </w:rPr>
-        <w:t xml:space="preserve">Closed. </w:t>
-      </w:r>
-      <w:r>
-        <w:rPr>
-          <w:rFonts w:ascii="Times New Roman" w:cs="Times New Roman" w:eastAsia="Times New Roman" w:hAnsi="Times New Roman"/>
-          <w:color w:val="1A1A1A"/>
-          <w:sz w:val="22"/>
-          <w:szCs w:val="22"/>
-        </w:rPr>
-        <w:t xml:space="preserve">Closed after feedback.</w:t>
-      </w:r>
-    </w:p>
-    <w:p>
-      <w:pPr>
-        <w:spacing w:after="120" w:before="0" w:line="276"/>
-        <w:jc w:val="both"/>
-      </w:pPr>
-      <w:r>
-        <w:rPr>
-          <w:rFonts w:ascii="Times New Roman" w:cs="Times New Roman" w:eastAsia="Times New Roman" w:hAnsi="Times New Roman"/>
-          <w:b/>
-          <w:bCs/>
-          <w:color w:val="1A1A1A"/>
-          <w:sz w:val="22"/>
-          <w:szCs w:val="22"/>
-        </w:rPr>
-        <w:t xml:space="preserve">8.2.9  </w:t>
-      </w:r>
-      <w:r>
-        <w:rPr>
-          <w:rFonts w:ascii="Times New Roman" w:cs="Times New Roman" w:eastAsia="Times New Roman" w:hAnsi="Times New Roman"/>
-          <w:b/>
-          <w:bCs/>
-          <w:color w:val="1A1A1A"/>
-          <w:sz w:val="22"/>
-          <w:szCs w:val="22"/>
-        </w:rPr>
         <w:t xml:space="preserve">Reopened. </w:t>
       </w:r>
       <w:r>
@@ -5677,7 +5640,7 @@
           <w:sz w:val="22"/>
           <w:szCs w:val="22"/>
         </w:rPr>
-        <w:t xml:space="preserve">Reopened by requestor for further action.</w:t>
+        <w:t xml:space="preserve">Reopened by requestor (not satisfied / needs further action).</w:t>
       </w:r>
     </w:p>
     <w:p>
@@ -5831,7 +5794,7 @@
           <w:sz w:val="22"/>
           <w:szCs w:val="22"/>
         </w:rPr>
-        <w:t xml:space="preserve">Staff (or Admin as requestor) submits via Submit Request.</w:t>
+        <w:t xml:space="preserve">Staff (or Admin as requestor) submits via Submit Request → Pending Approval.</w:t>
       </w:r>
     </w:p>
     <w:p>
@@ -5857,7 +5820,7 @@
           <w:sz w:val="22"/>
           <w:szCs w:val="22"/>
         </w:rPr>
-        <w:t xml:space="preserve">Admin approves or rejects the request on Approvals.</w:t>
+        <w:t xml:space="preserve">Admin approves on Approvals → Open (or rejects → Rejected).</w:t>
       </w:r>
     </w:p>
     <w:p>
@@ -5883,7 +5846,7 @@
           <w:sz w:val="22"/>
           <w:szCs w:val="22"/>
         </w:rPr>
-        <w:t xml:space="preserve">Admin assigns ICT personnel.</w:t>
+        <w:t xml:space="preserve">Admin assigns ICT personnel → In Progress.</w:t>
       </w:r>
     </w:p>
     <w:p>
@@ -5909,7 +5872,7 @@
           <w:sz w:val="22"/>
           <w:szCs w:val="22"/>
         </w:rPr>
-        <w:t xml:space="preserve">ICT performs the work under My Assignments.</w:t>
+        <w:t xml:space="preserve">ICT performs the work under My Assignments (Admin may also set Pending as a hold).</w:t>
       </w:r>
     </w:p>
     <w:p>
@@ -5935,7 +5898,7 @@
           <w:sz w:val="22"/>
           <w:szCs w:val="22"/>
         </w:rPr>
-        <w:t xml:space="preserve">Requestor marks service complete, submits feedback, then closes the ticket (or reopens it).</w:t>
+        <w:t xml:space="preserve">Requestor marks service complete → Resolved, submits feedback, then closes (Closed) or reopens (Reopened).</w:t>
       </w:r>
     </w:p>
     <w:p>

</xml_diff>